<commit_message>
Fix Question 4: add the two missing selectors and correct box2 class name
Cross-checked against the original assignment PDF:
- Q4 actually lists SIX selectors; add the two that were missing from the
  earlier screenshots: #container .box (lines 2, 6) and #container > .box
  (line 2 only), each with why-selected / why-not reasoning.
- The class on line 4 is box2 (not box-2); corrected throughout. (Does not
  change any selector result.)

Updated both challenge-1/ANSWERS.md and the Word submission document.

Co-Authored-By: Claude Opus 4.8 <noreply@anthropic.com>
</commit_message>
<xml_diff>
--- a/Bala-Manikandan-Ziptrrip-Developer-Assignment.docx
+++ b/Bala-Manikandan-Ziptrrip-Developer-Assignment.docx
@@ -85,7 +85,7 @@
     <w:sdt>
       <w:sdtPr>
         <w:alias w:val="Contents"/>
-        <w:id w:val="-1909909352"/>
+        <w:id w:val="1686548474"/>
       </w:sdtPr>
       <w:sdtEndPr/>
       <w:sdtContent>
@@ -113,7 +113,7 @@
           <w:r>
             <w:fldChar w:fldCharType="separate"/>
           </w:r>
-          <w:hyperlink w:anchor="_Toc233560975" w:history="1">
+          <w:hyperlink w:anchor="_Toc233561738" w:history="1">
             <w:r>
               <w:rPr>
                 <w:rStyle w:val="Hyperlink"/>
@@ -137,7 +137,7 @@
               <w:rPr>
                 <w:noProof/>
               </w:rPr>
-              <w:instrText xml:space="preserve"> PAGEREF _Toc233560975 \h </w:instrText>
+              <w:instrText xml:space="preserve"> PAGEREF _Toc233561738 \h </w:instrText>
             </w:r>
             <w:r>
               <w:rPr>
@@ -179,7 +179,7 @@
               <w14:ligatures w14:val="standardContextual"/>
             </w:rPr>
           </w:pPr>
-          <w:hyperlink w:anchor="_Toc233560976" w:history="1">
+          <w:hyperlink w:anchor="_Toc233561739" w:history="1">
             <w:r>
               <w:rPr>
                 <w:rStyle w:val="Hyperlink"/>
@@ -203,7 +203,7 @@
               <w:rPr>
                 <w:noProof/>
               </w:rPr>
-              <w:instrText xml:space="preserve"> PAGEREF _Toc233560976 \h </w:instrText>
+              <w:instrText xml:space="preserve"> PAGEREF _Toc233561739 \h </w:instrText>
             </w:r>
             <w:r>
               <w:rPr>
@@ -245,7 +245,7 @@
               <w14:ligatures w14:val="standardContextual"/>
             </w:rPr>
           </w:pPr>
-          <w:hyperlink w:anchor="_Toc233560977" w:history="1">
+          <w:hyperlink w:anchor="_Toc233561740" w:history="1">
             <w:r>
               <w:rPr>
                 <w:rStyle w:val="Hyperlink"/>
@@ -269,7 +269,7 @@
               <w:rPr>
                 <w:noProof/>
               </w:rPr>
-              <w:instrText xml:space="preserve"> PAGEREF _Toc233560977 \h </w:instrText>
+              <w:instrText xml:space="preserve"> PAGEREF _Toc233561740 \h </w:instrText>
             </w:r>
             <w:r>
               <w:rPr>
@@ -311,7 +311,7 @@
               <w14:ligatures w14:val="standardContextual"/>
             </w:rPr>
           </w:pPr>
-          <w:hyperlink w:anchor="_Toc233560978" w:history="1">
+          <w:hyperlink w:anchor="_Toc233561741" w:history="1">
             <w:r>
               <w:rPr>
                 <w:rStyle w:val="Hyperlink"/>
@@ -335,7 +335,7 @@
               <w:rPr>
                 <w:noProof/>
               </w:rPr>
-              <w:instrText xml:space="preserve"> PAGEREF _Toc233560978 \h </w:instrText>
+              <w:instrText xml:space="preserve"> PAGEREF _Toc233561741 \h </w:instrText>
             </w:r>
             <w:r>
               <w:rPr>
@@ -377,7 +377,7 @@
               <w14:ligatures w14:val="standardContextual"/>
             </w:rPr>
           </w:pPr>
-          <w:hyperlink w:anchor="_Toc233560979" w:history="1">
+          <w:hyperlink w:anchor="_Toc233561742" w:history="1">
             <w:r>
               <w:rPr>
                 <w:rStyle w:val="Hyperlink"/>
@@ -401,7 +401,7 @@
               <w:rPr>
                 <w:noProof/>
               </w:rPr>
-              <w:instrText xml:space="preserve"> PAGEREF _Toc233560979 \h </w:instrText>
+              <w:instrText xml:space="preserve"> PAGEREF _Toc233561742 \h </w:instrText>
             </w:r>
             <w:r>
               <w:rPr>
@@ -443,7 +443,7 @@
               <w14:ligatures w14:val="standardContextual"/>
             </w:rPr>
           </w:pPr>
-          <w:hyperlink w:anchor="_Toc233560980" w:history="1">
+          <w:hyperlink w:anchor="_Toc233561743" w:history="1">
             <w:r>
               <w:rPr>
                 <w:rStyle w:val="Hyperlink"/>
@@ -467,7 +467,7 @@
               <w:rPr>
                 <w:noProof/>
               </w:rPr>
-              <w:instrText xml:space="preserve"> PAGEREF _Toc233560980 \h </w:instrText>
+              <w:instrText xml:space="preserve"> PAGEREF _Toc233561743 \h </w:instrText>
             </w:r>
             <w:r>
               <w:rPr>
@@ -509,7 +509,7 @@
               <w14:ligatures w14:val="standardContextual"/>
             </w:rPr>
           </w:pPr>
-          <w:hyperlink w:anchor="_Toc233560981" w:history="1">
+          <w:hyperlink w:anchor="_Toc233561744" w:history="1">
             <w:r>
               <w:rPr>
                 <w:rStyle w:val="Hyperlink"/>
@@ -533,7 +533,7 @@
               <w:rPr>
                 <w:noProof/>
               </w:rPr>
-              <w:instrText xml:space="preserve"> PAGEREF _Toc233560981 \h </w:instrText>
+              <w:instrText xml:space="preserve"> PAGEREF _Toc233561744 \h </w:instrText>
             </w:r>
             <w:r>
               <w:rPr>
@@ -575,7 +575,7 @@
               <w14:ligatures w14:val="standardContextual"/>
             </w:rPr>
           </w:pPr>
-          <w:hyperlink w:anchor="_Toc233560982" w:history="1">
+          <w:hyperlink w:anchor="_Toc233561745" w:history="1">
             <w:r>
               <w:rPr>
                 <w:rStyle w:val="Hyperlink"/>
@@ -599,7 +599,7 @@
               <w:rPr>
                 <w:noProof/>
               </w:rPr>
-              <w:instrText xml:space="preserve"> PAGEREF _Toc233560982 \h </w:instrText>
+              <w:instrText xml:space="preserve"> PAGEREF _Toc233561745 \h </w:instrText>
             </w:r>
             <w:r>
               <w:rPr>
@@ -641,7 +641,7 @@
               <w14:ligatures w14:val="standardContextual"/>
             </w:rPr>
           </w:pPr>
-          <w:hyperlink w:anchor="_Toc233560983" w:history="1">
+          <w:hyperlink w:anchor="_Toc233561746" w:history="1">
             <w:r>
               <w:rPr>
                 <w:rStyle w:val="Hyperlink"/>
@@ -665,7 +665,7 @@
               <w:rPr>
                 <w:noProof/>
               </w:rPr>
-              <w:instrText xml:space="preserve"> PAGEREF _Toc233560983 \h </w:instrText>
+              <w:instrText xml:space="preserve"> PAGEREF _Toc233561746 \h </w:instrText>
             </w:r>
             <w:r>
               <w:rPr>
@@ -707,7 +707,7 @@
               <w14:ligatures w14:val="standardContextual"/>
             </w:rPr>
           </w:pPr>
-          <w:hyperlink w:anchor="_Toc233560984" w:history="1">
+          <w:hyperlink w:anchor="_Toc233561747" w:history="1">
             <w:r>
               <w:rPr>
                 <w:rStyle w:val="Hyperlink"/>
@@ -731,7 +731,7 @@
               <w:rPr>
                 <w:noProof/>
               </w:rPr>
-              <w:instrText xml:space="preserve"> PAGEREF _Toc233560984 \h </w:instrText>
+              <w:instrText xml:space="preserve"> PAGEREF _Toc233561747 \h </w:instrText>
             </w:r>
             <w:r>
               <w:rPr>
@@ -773,7 +773,7 @@
               <w14:ligatures w14:val="standardContextual"/>
             </w:rPr>
           </w:pPr>
-          <w:hyperlink w:anchor="_Toc233560985" w:history="1">
+          <w:hyperlink w:anchor="_Toc233561748" w:history="1">
             <w:r>
               <w:rPr>
                 <w:rStyle w:val="Hyperlink"/>
@@ -797,7 +797,7 @@
               <w:rPr>
                 <w:noProof/>
               </w:rPr>
-              <w:instrText xml:space="preserve"> PAGEREF _Toc233560985 \h </w:instrText>
+              <w:instrText xml:space="preserve"> PAGEREF _Toc233561748 \h </w:instrText>
             </w:r>
             <w:r>
               <w:rPr>
@@ -839,7 +839,7 @@
               <w14:ligatures w14:val="standardContextual"/>
             </w:rPr>
           </w:pPr>
-          <w:hyperlink w:anchor="_Toc233560986" w:history="1">
+          <w:hyperlink w:anchor="_Toc233561749" w:history="1">
             <w:r>
               <w:rPr>
                 <w:rStyle w:val="Hyperlink"/>
@@ -863,7 +863,7 @@
               <w:rPr>
                 <w:noProof/>
               </w:rPr>
-              <w:instrText xml:space="preserve"> PAGEREF _Toc233560986 \h </w:instrText>
+              <w:instrText xml:space="preserve"> PAGEREF _Toc233561749 \h </w:instrText>
             </w:r>
             <w:r>
               <w:rPr>
@@ -905,7 +905,7 @@
               <w14:ligatures w14:val="standardContextual"/>
             </w:rPr>
           </w:pPr>
-          <w:hyperlink w:anchor="_Toc233560987" w:history="1">
+          <w:hyperlink w:anchor="_Toc233561750" w:history="1">
             <w:r>
               <w:rPr>
                 <w:rStyle w:val="Hyperlink"/>
@@ -929,7 +929,7 @@
               <w:rPr>
                 <w:noProof/>
               </w:rPr>
-              <w:instrText xml:space="preserve"> PAGEREF _Toc233560987 \h </w:instrText>
+              <w:instrText xml:space="preserve"> PAGEREF _Toc233561750 \h </w:instrText>
             </w:r>
             <w:r>
               <w:rPr>
@@ -971,7 +971,7 @@
               <w14:ligatures w14:val="standardContextual"/>
             </w:rPr>
           </w:pPr>
-          <w:hyperlink w:anchor="_Toc233560988" w:history="1">
+          <w:hyperlink w:anchor="_Toc233561751" w:history="1">
             <w:r>
               <w:rPr>
                 <w:rStyle w:val="Hyperlink"/>
@@ -995,7 +995,7 @@
               <w:rPr>
                 <w:noProof/>
               </w:rPr>
-              <w:instrText xml:space="preserve"> PAGEREF _Toc233560988 \h </w:instrText>
+              <w:instrText xml:space="preserve"> PAGEREF _Toc233561751 \h </w:instrText>
             </w:r>
             <w:r>
               <w:rPr>
@@ -1038,7 +1038,7 @@
       <w:pPr>
         <w:pStyle w:val="Heading1"/>
       </w:pPr>
-      <w:bookmarkStart w:id="0" w:name="_Toc233560975"/>
+      <w:bookmarkStart w:id="0" w:name="_Toc233561738"/>
       <w:r>
         <w:lastRenderedPageBreak/>
         <w:t>Question 1 — Number pattern</w:t>
@@ -1448,7 +1448,7 @@
       <w:pPr>
         <w:pStyle w:val="Heading1"/>
       </w:pPr>
-      <w:bookmarkStart w:id="1" w:name="_Toc233560976"/>
+      <w:bookmarkStart w:id="1" w:name="_Toc233561739"/>
       <w:r>
         <w:t>Question 2 — Reverse a string</w:t>
       </w:r>
@@ -1658,7 +1658,7 @@
       <w:pPr>
         <w:pStyle w:val="Heading1"/>
       </w:pPr>
-      <w:bookmarkStart w:id="2" w:name="_Toc233560977"/>
+      <w:bookmarkStart w:id="2" w:name="_Toc233561740"/>
       <w:r>
         <w:t>Question 3 — Remove duplicates</w:t>
       </w:r>
@@ -1892,7 +1892,7 @@
         <w:pStyle w:val="Heading1"/>
         <w:pageBreakBefore/>
       </w:pPr>
-      <w:bookmarkStart w:id="3" w:name="_Toc233560978"/>
+      <w:bookmarkStart w:id="3" w:name="_Toc233561741"/>
       <w:r>
         <w:lastRenderedPageBreak/>
         <w:t>Question 4 — CSS selectors</w:t>
@@ -1961,7 +1961,7 @@
           <w:sz w:val="18"/>
           <w:szCs w:val="18"/>
         </w:rPr>
-        <w:t>4       &lt;div class="box-2"&gt;&lt;/div&gt;</w:t>
+        <w:t>4       &lt;div class="box2"&gt;&lt;/div&gt;</w:t>
       </w:r>
     </w:p>
     <w:p>
@@ -2072,7 +2072,7 @@
           <w:left w:w="10" w:type="dxa"/>
           <w:right w:w="10" w:type="dxa"/>
         </w:tblCellMar>
-        <w:tblLook w:val="0000" w:firstRow="0" w:lastRow="0" w:firstColumn="0" w:lastColumn="0" w:noHBand="0" w:noVBand="0"/>
+        <w:tblLook w:val="04A0" w:firstRow="1" w:lastRow="0" w:firstColumn="1" w:lastColumn="0" w:noHBand="0" w:noVBand="1"/>
       </w:tblPr>
       <w:tblGrid>
         <w:gridCol w:w="900"/>
@@ -2540,7 +2540,7 @@
                 <w:sz w:val="18"/>
                 <w:szCs w:val="18"/>
               </w:rPr>
-              <w:t>.box-2</w:t>
+              <w:t>.box2</w:t>
             </w:r>
           </w:p>
         </w:tc>
@@ -2606,7 +2606,7 @@
           </w:tcPr>
           <w:p>
             <w:r>
-              <w:t>box-2</w:t>
+              <w:t>box2</w:t>
             </w:r>
           </w:p>
         </w:tc>
@@ -3048,7 +3048,7 @@
         <w:t xml:space="preserve">Why not the others: </w:t>
       </w:r>
       <w:r>
-        <w:t>Line 1 has an id, not a class. Line 4 is class="box-2" — class matching is on whole tokens, and "box-2" is not "box". Line 5 is a div with no class.</w:t>
+        <w:t>Line 1 has an id, not a class. Line 4 is class="box2" — class matching is on whole tokens, and "box2" is not "box". Line 5 is a div with no class.</w:t>
       </w:r>
     </w:p>
     <w:p>
@@ -3168,7 +3168,7 @@
         <w:t xml:space="preserve">Why not the others: </w:t>
       </w:r>
       <w:r>
-        <w:t>Line 4 is a div but its class is "box-2"; line 1 is a div but has no "box" class.</w:t>
+        <w:t>Line 4 is a div but its class is "box2"; line 1 is a div but has no "box" class.</w:t>
       </w:r>
     </w:p>
     <w:p>
@@ -3228,7 +3228,7 @@
         <w:t xml:space="preserve">Why these: </w:t>
       </w:r>
       <w:r>
-        <w:t>an attribute-presence selector matches any element that has a class attribute, whatever its value — so line 4 (box-2) is included here.</w:t>
+        <w:t>an attribute-presence selector matches any element that has a class attribute, whatever its value — so line 4 (box2) is included here.</w:t>
       </w:r>
     </w:p>
     <w:p>
@@ -3253,14 +3253,134 @@
     </w:p>
     <w:p>
       <w:pPr>
-        <w:spacing w:before="200" w:after="80"/>
-      </w:pPr>
+        <w:spacing w:before="180" w:after="60"/>
+      </w:pPr>
+      <w:r>
+        <w:rPr>
+          <w:rFonts w:ascii="Consolas" w:eastAsia="Consolas" w:hAnsi="Consolas" w:cs="Consolas"/>
+          <w:sz w:val="20"/>
+          <w:szCs w:val="20"/>
+        </w:rPr>
+        <w:lastRenderedPageBreak/>
+        <w:t>#container .box</w:t>
+      </w:r>
       <w:r>
         <w:rPr>
           <w:b/>
           <w:bCs/>
         </w:rPr>
-        <w:lastRenderedPageBreak/>
+        <w:t xml:space="preserve">  →  lines 2, 6</w:t>
+      </w:r>
+    </w:p>
+    <w:p>
+      <w:pPr>
+        <w:pStyle w:val="ListParagraph"/>
+        <w:numPr>
+          <w:ilvl w:val="0"/>
+          <w:numId w:val="2"/>
+        </w:numPr>
+        <w:spacing w:after="40"/>
+      </w:pPr>
+      <w:r>
+        <w:rPr>
+          <w:b/>
+          <w:bCs/>
+        </w:rPr>
+        <w:t xml:space="preserve">Why these: </w:t>
+      </w:r>
+      <w:r>
+        <w:t>#container matches the element with id="container" (line 1); the space is a descendant combinator, so this means any .box inside #container at any depth. Line 2 is a direct child; line 6 is a deeper descendant (inside the div on line 5).</w:t>
+      </w:r>
+    </w:p>
+    <w:p>
+      <w:pPr>
+        <w:pStyle w:val="ListParagraph"/>
+        <w:numPr>
+          <w:ilvl w:val="0"/>
+          <w:numId w:val="2"/>
+        </w:numPr>
+        <w:spacing w:after="40"/>
+      </w:pPr>
+      <w:r>
+        <w:rPr>
+          <w:b/>
+          <w:bCs/>
+        </w:rPr>
+        <w:t xml:space="preserve">Why not the others: </w:t>
+      </w:r>
+      <w:r>
+        <w:t>Line 10’s box is outside #container (a sibling after the closing tag on line 8), so it has no #container ancestor. Line 4 is box2, not box. (Same result as div .box here, since #container is the outermost div.)</w:t>
+      </w:r>
+    </w:p>
+    <w:p>
+      <w:pPr>
+        <w:spacing w:before="180" w:after="60"/>
+      </w:pPr>
+      <w:r>
+        <w:rPr>
+          <w:rFonts w:ascii="Consolas" w:eastAsia="Consolas" w:hAnsi="Consolas" w:cs="Consolas"/>
+          <w:sz w:val="20"/>
+          <w:szCs w:val="20"/>
+        </w:rPr>
+        <w:t>#container &gt; .box</w:t>
+      </w:r>
+      <w:r>
+        <w:rPr>
+          <w:b/>
+          <w:bCs/>
+        </w:rPr>
+        <w:t xml:space="preserve">  →  lines 2</w:t>
+      </w:r>
+    </w:p>
+    <w:p>
+      <w:pPr>
+        <w:pStyle w:val="ListParagraph"/>
+        <w:numPr>
+          <w:ilvl w:val="0"/>
+          <w:numId w:val="2"/>
+        </w:numPr>
+        <w:spacing w:after="40"/>
+      </w:pPr>
+      <w:r>
+        <w:rPr>
+          <w:b/>
+          <w:bCs/>
+        </w:rPr>
+        <w:t xml:space="preserve">Why these: </w:t>
+      </w:r>
+      <w:r>
+        <w:t>the &gt; is the child combinator — only .box elements that are direct children of #container. Line 2 is a direct child of #container.</w:t>
+      </w:r>
+    </w:p>
+    <w:p>
+      <w:pPr>
+        <w:pStyle w:val="ListParagraph"/>
+        <w:numPr>
+          <w:ilvl w:val="0"/>
+          <w:numId w:val="2"/>
+        </w:numPr>
+        <w:spacing w:after="40"/>
+      </w:pPr>
+      <w:r>
+        <w:rPr>
+          <w:b/>
+          <w:bCs/>
+        </w:rPr>
+        <w:t xml:space="preserve">Why not the others: </w:t>
+      </w:r>
+      <w:r>
+        <w:t>Line 6 is excluded because it is a grandchild (its parent is the div on line 5, not #container); &gt; does not reach beyond one level. Line 10 is outside #container; line 4 is box2. This is the strictest of the three “box inside container” selectors.</w:t>
+      </w:r>
+    </w:p>
+    <w:p>
+      <w:pPr>
+        <w:spacing w:before="200" w:after="80"/>
+      </w:pPr>
+      <w:r>
+        <w:rPr>
+          <w:b/>
+          <w:bCs/>
+        </w:rPr>
         <w:t>Summary</w:t>
       </w:r>
     </w:p>
@@ -3279,11 +3399,11 @@
           <w:left w:w="10" w:type="dxa"/>
           <w:right w:w="10" w:type="dxa"/>
         </w:tblCellMar>
-        <w:tblLook w:val="0000" w:firstRow="0" w:lastRow="0" w:firstColumn="0" w:lastColumn="0" w:noHBand="0" w:noVBand="0"/>
+        <w:tblLook w:val="04A0" w:firstRow="1" w:lastRow="0" w:firstColumn="1" w:lastColumn="0" w:noHBand="0" w:noVBand="1"/>
       </w:tblPr>
       <w:tblGrid>
-        <w:gridCol w:w="2200"/>
-        <w:gridCol w:w="2400"/>
+        <w:gridCol w:w="2500"/>
+        <w:gridCol w:w="2100"/>
         <w:gridCol w:w="4760"/>
       </w:tblGrid>
       <w:tr>
@@ -3298,7 +3418,7 @@
         </w:trPr>
         <w:tc>
           <w:tcPr>
-            <w:tcW w:w="2200" w:type="dxa"/>
+            <w:tcW w:w="2500" w:type="dxa"/>
             <w:tcBorders>
               <w:top w:val="single" w:sz="1" w:space="0" w:color="BFBFBF"/>
               <w:left w:val="single" w:sz="1" w:space="0" w:color="BFBFBF"/>
@@ -3325,7 +3445,7 @@
         </w:tc>
         <w:tc>
           <w:tcPr>
-            <w:tcW w:w="2400" w:type="dxa"/>
+            <w:tcW w:w="2100" w:type="dxa"/>
             <w:tcBorders>
               <w:top w:val="single" w:sz="1" w:space="0" w:color="BFBFBF"/>
               <w:left w:val="single" w:sz="1" w:space="0" w:color="BFBFBF"/>
@@ -3387,7 +3507,7 @@
         </w:tblPrEx>
         <w:tc>
           <w:tcPr>
-            <w:tcW w:w="2200" w:type="dxa"/>
+            <w:tcW w:w="2500" w:type="dxa"/>
             <w:tcBorders>
               <w:top w:val="single" w:sz="1" w:space="0" w:color="BFBFBF"/>
               <w:left w:val="single" w:sz="1" w:space="0" w:color="BFBFBF"/>
@@ -3414,7 +3534,7 @@
         </w:tc>
         <w:tc>
           <w:tcPr>
-            <w:tcW w:w="2400" w:type="dxa"/>
+            <w:tcW w:w="2100" w:type="dxa"/>
             <w:tcBorders>
               <w:top w:val="single" w:sz="1" w:space="0" w:color="BFBFBF"/>
               <w:left w:val="single" w:sz="1" w:space="0" w:color="BFBFBF"/>
@@ -3452,7 +3572,7 @@
           </w:tcPr>
           <w:p>
             <w:r>
-              <w:t>class token must equal "box" (so "box-2" is out)</w:t>
+              <w:t>class token must equal "box" (so "box2" is out)</w:t>
             </w:r>
           </w:p>
         </w:tc>
@@ -3466,7 +3586,7 @@
         </w:tblPrEx>
         <w:tc>
           <w:tcPr>
-            <w:tcW w:w="2200" w:type="dxa"/>
+            <w:tcW w:w="2500" w:type="dxa"/>
             <w:tcBorders>
               <w:top w:val="single" w:sz="1" w:space="0" w:color="BFBFBF"/>
               <w:left w:val="single" w:sz="1" w:space="0" w:color="BFBFBF"/>
@@ -3493,7 +3613,7 @@
         </w:tc>
         <w:tc>
           <w:tcPr>
-            <w:tcW w:w="2400" w:type="dxa"/>
+            <w:tcW w:w="2100" w:type="dxa"/>
             <w:tcBorders>
               <w:top w:val="single" w:sz="1" w:space="0" w:color="BFBFBF"/>
               <w:left w:val="single" w:sz="1" w:space="0" w:color="BFBFBF"/>
@@ -3545,7 +3665,7 @@
         </w:tblPrEx>
         <w:tc>
           <w:tcPr>
-            <w:tcW w:w="2200" w:type="dxa"/>
+            <w:tcW w:w="2500" w:type="dxa"/>
             <w:tcBorders>
               <w:top w:val="single" w:sz="1" w:space="0" w:color="BFBFBF"/>
               <w:left w:val="single" w:sz="1" w:space="0" w:color="BFBFBF"/>
@@ -3572,7 +3692,7 @@
         </w:tc>
         <w:tc>
           <w:tcPr>
-            <w:tcW w:w="2400" w:type="dxa"/>
+            <w:tcW w:w="2100" w:type="dxa"/>
             <w:tcBorders>
               <w:top w:val="single" w:sz="1" w:space="0" w:color="BFBFBF"/>
               <w:left w:val="single" w:sz="1" w:space="0" w:color="BFBFBF"/>
@@ -3624,7 +3744,7 @@
         </w:tblPrEx>
         <w:tc>
           <w:tcPr>
-            <w:tcW w:w="2200" w:type="dxa"/>
+            <w:tcW w:w="2500" w:type="dxa"/>
             <w:tcBorders>
               <w:top w:val="single" w:sz="1" w:space="0" w:color="BFBFBF"/>
               <w:left w:val="single" w:sz="1" w:space="0" w:color="BFBFBF"/>
@@ -3651,7 +3771,7 @@
         </w:tc>
         <w:tc>
           <w:tcPr>
-            <w:tcW w:w="2400" w:type="dxa"/>
+            <w:tcW w:w="2100" w:type="dxa"/>
             <w:tcBorders>
               <w:top w:val="single" w:sz="1" w:space="0" w:color="BFBFBF"/>
               <w:left w:val="single" w:sz="1" w:space="0" w:color="BFBFBF"/>
@@ -3694,13 +3814,171 @@
           </w:p>
         </w:tc>
       </w:tr>
+      <w:tr>
+        <w:tblPrEx>
+          <w:tblCellMar>
+            <w:top w:w="0" w:type="dxa"/>
+            <w:bottom w:w="0" w:type="dxa"/>
+          </w:tblCellMar>
+        </w:tblPrEx>
+        <w:tc>
+          <w:tcPr>
+            <w:tcW w:w="2500" w:type="dxa"/>
+            <w:tcBorders>
+              <w:top w:val="single" w:sz="1" w:space="0" w:color="BFBFBF"/>
+              <w:left w:val="single" w:sz="1" w:space="0" w:color="BFBFBF"/>
+              <w:bottom w:val="single" w:sz="1" w:space="0" w:color="BFBFBF"/>
+              <w:right w:val="single" w:sz="1" w:space="0" w:color="BFBFBF"/>
+            </w:tcBorders>
+            <w:tcMar>
+              <w:top w:w="60" w:type="dxa"/>
+              <w:left w:w="110" w:type="dxa"/>
+              <w:bottom w:w="60" w:type="dxa"/>
+              <w:right w:w="110" w:type="dxa"/>
+            </w:tcMar>
+          </w:tcPr>
+          <w:p>
+            <w:r>
+              <w:rPr>
+                <w:rFonts w:ascii="Consolas" w:eastAsia="Consolas" w:hAnsi="Consolas" w:cs="Consolas"/>
+                <w:sz w:val="18"/>
+                <w:szCs w:val="18"/>
+              </w:rPr>
+              <w:t>#container .box</w:t>
+            </w:r>
+          </w:p>
+        </w:tc>
+        <w:tc>
+          <w:tcPr>
+            <w:tcW w:w="2100" w:type="dxa"/>
+            <w:tcBorders>
+              <w:top w:val="single" w:sz="1" w:space="0" w:color="BFBFBF"/>
+              <w:left w:val="single" w:sz="1" w:space="0" w:color="BFBFBF"/>
+              <w:bottom w:val="single" w:sz="1" w:space="0" w:color="BFBFBF"/>
+              <w:right w:val="single" w:sz="1" w:space="0" w:color="BFBFBF"/>
+            </w:tcBorders>
+            <w:tcMar>
+              <w:top w:w="60" w:type="dxa"/>
+              <w:left w:w="110" w:type="dxa"/>
+              <w:bottom w:w="60" w:type="dxa"/>
+              <w:right w:w="110" w:type="dxa"/>
+            </w:tcMar>
+          </w:tcPr>
+          <w:p>
+            <w:r>
+              <w:t>2, 6</w:t>
+            </w:r>
+          </w:p>
+        </w:tc>
+        <w:tc>
+          <w:tcPr>
+            <w:tcW w:w="4760" w:type="dxa"/>
+            <w:tcBorders>
+              <w:top w:val="single" w:sz="1" w:space="0" w:color="BFBFBF"/>
+              <w:left w:val="single" w:sz="1" w:space="0" w:color="BFBFBF"/>
+              <w:bottom w:val="single" w:sz="1" w:space="0" w:color="BFBFBF"/>
+              <w:right w:val="single" w:sz="1" w:space="0" w:color="BFBFBF"/>
+            </w:tcBorders>
+            <w:tcMar>
+              <w:top w:w="60" w:type="dxa"/>
+              <w:left w:w="110" w:type="dxa"/>
+              <w:bottom w:w="60" w:type="dxa"/>
+              <w:right w:w="110" w:type="dxa"/>
+            </w:tcMar>
+          </w:tcPr>
+          <w:p>
+            <w:r>
+              <w:t>any .box descendant of #container (line 10 is outside it)</w:t>
+            </w:r>
+          </w:p>
+        </w:tc>
+      </w:tr>
+      <w:tr>
+        <w:tblPrEx>
+          <w:tblCellMar>
+            <w:top w:w="0" w:type="dxa"/>
+            <w:bottom w:w="0" w:type="dxa"/>
+          </w:tblCellMar>
+        </w:tblPrEx>
+        <w:tc>
+          <w:tcPr>
+            <w:tcW w:w="2500" w:type="dxa"/>
+            <w:tcBorders>
+              <w:top w:val="single" w:sz="1" w:space="0" w:color="BFBFBF"/>
+              <w:left w:val="single" w:sz="1" w:space="0" w:color="BFBFBF"/>
+              <w:bottom w:val="single" w:sz="1" w:space="0" w:color="BFBFBF"/>
+              <w:right w:val="single" w:sz="1" w:space="0" w:color="BFBFBF"/>
+            </w:tcBorders>
+            <w:tcMar>
+              <w:top w:w="60" w:type="dxa"/>
+              <w:left w:w="110" w:type="dxa"/>
+              <w:bottom w:w="60" w:type="dxa"/>
+              <w:right w:w="110" w:type="dxa"/>
+            </w:tcMar>
+          </w:tcPr>
+          <w:p>
+            <w:r>
+              <w:rPr>
+                <w:rFonts w:ascii="Consolas" w:eastAsia="Consolas" w:hAnsi="Consolas" w:cs="Consolas"/>
+                <w:sz w:val="18"/>
+                <w:szCs w:val="18"/>
+              </w:rPr>
+              <w:t>#container &gt; .box</w:t>
+            </w:r>
+          </w:p>
+        </w:tc>
+        <w:tc>
+          <w:tcPr>
+            <w:tcW w:w="2100" w:type="dxa"/>
+            <w:tcBorders>
+              <w:top w:val="single" w:sz="1" w:space="0" w:color="BFBFBF"/>
+              <w:left w:val="single" w:sz="1" w:space="0" w:color="BFBFBF"/>
+              <w:bottom w:val="single" w:sz="1" w:space="0" w:color="BFBFBF"/>
+              <w:right w:val="single" w:sz="1" w:space="0" w:color="BFBFBF"/>
+            </w:tcBorders>
+            <w:tcMar>
+              <w:top w:w="60" w:type="dxa"/>
+              <w:left w:w="110" w:type="dxa"/>
+              <w:bottom w:w="60" w:type="dxa"/>
+              <w:right w:w="110" w:type="dxa"/>
+            </w:tcMar>
+          </w:tcPr>
+          <w:p>
+            <w:r>
+              <w:t>2</w:t>
+            </w:r>
+          </w:p>
+        </w:tc>
+        <w:tc>
+          <w:tcPr>
+            <w:tcW w:w="4760" w:type="dxa"/>
+            <w:tcBorders>
+              <w:top w:val="single" w:sz="1" w:space="0" w:color="BFBFBF"/>
+              <w:left w:val="single" w:sz="1" w:space="0" w:color="BFBFBF"/>
+              <w:bottom w:val="single" w:sz="1" w:space="0" w:color="BFBFBF"/>
+              <w:right w:val="single" w:sz="1" w:space="0" w:color="BFBFBF"/>
+            </w:tcBorders>
+            <w:tcMar>
+              <w:top w:w="60" w:type="dxa"/>
+              <w:left w:w="110" w:type="dxa"/>
+              <w:bottom w:w="60" w:type="dxa"/>
+              <w:right w:w="110" w:type="dxa"/>
+            </w:tcMar>
+          </w:tcPr>
+          <w:p>
+            <w:r>
+              <w:t>only .box direct children of #container (line 6 is a grandchild)</w:t>
+            </w:r>
+          </w:p>
+        </w:tc>
+      </w:tr>
     </w:tbl>
     <w:p>
       <w:pPr>
         <w:pStyle w:val="Heading1"/>
         <w:pageBreakBefore/>
       </w:pPr>
-      <w:bookmarkStart w:id="4" w:name="_Toc233560979"/>
+      <w:bookmarkStart w:id="4" w:name="_Toc233561742"/>
       <w:r>
         <w:lastRenderedPageBreak/>
         <w:t>Question 5 — Three-box layout</w:t>
@@ -3719,7 +3997,7 @@
       <w:pPr>
         <w:pStyle w:val="Heading2"/>
       </w:pPr>
-      <w:bookmarkStart w:id="5" w:name="_Toc233560980"/>
+      <w:bookmarkStart w:id="5" w:name="_Toc233561743"/>
       <w:r>
         <w:t>1. Flexbox (recommended)</w:t>
       </w:r>
@@ -3781,7 +4059,7 @@
       <w:pPr>
         <w:pStyle w:val="Heading2"/>
       </w:pPr>
-      <w:bookmarkStart w:id="6" w:name="_Toc233560981"/>
+      <w:bookmarkStart w:id="6" w:name="_Toc233561744"/>
       <w:r>
         <w:t>2. CSS Grid</w:t>
       </w:r>
@@ -3829,7 +4107,7 @@
       <w:pPr>
         <w:pStyle w:val="Heading2"/>
       </w:pPr>
-      <w:bookmarkStart w:id="7" w:name="_Toc233560982"/>
+      <w:bookmarkStart w:id="7" w:name="_Toc233561745"/>
       <w:r>
         <w:t>3. Floats + margins (classic)</w:t>
       </w:r>
@@ -3905,7 +4183,7 @@
       <w:pPr>
         <w:pStyle w:val="Heading2"/>
       </w:pPr>
-      <w:bookmarkStart w:id="8" w:name="_Toc233560983"/>
+      <w:bookmarkStart w:id="8" w:name="_Toc233561746"/>
       <w:r>
         <w:t>4. Absolute positioning</w:t>
       </w:r>
@@ -3981,7 +4259,7 @@
       <w:pPr>
         <w:pStyle w:val="Heading2"/>
       </w:pPr>
-      <w:bookmarkStart w:id="9" w:name="_Toc233560984"/>
+      <w:bookmarkStart w:id="9" w:name="_Toc233561747"/>
       <w:r>
         <w:t>5. display: table</w:t>
       </w:r>
@@ -4043,7 +4321,7 @@
       <w:pPr>
         <w:pStyle w:val="Heading2"/>
       </w:pPr>
-      <w:bookmarkStart w:id="10" w:name="_Toc233560985"/>
+      <w:bookmarkStart w:id="10" w:name="_Toc233561748"/>
       <w:r>
         <w:t>6. inline-block + calc()</w:t>
       </w:r>
@@ -4135,7 +4413,7 @@
         <w:pStyle w:val="Heading1"/>
         <w:pageBreakBefore/>
       </w:pPr>
-      <w:bookmarkStart w:id="11" w:name="_Toc233560986"/>
+      <w:bookmarkStart w:id="11" w:name="_Toc233561749"/>
       <w:r>
         <w:lastRenderedPageBreak/>
         <w:t>Challenge 2 — Todo Application</w:t>
@@ -4169,7 +4447,7 @@
       <w:pPr>
         <w:pStyle w:val="Heading2"/>
       </w:pPr>
-      <w:bookmarkStart w:id="12" w:name="_Toc233560987"/>
+      <w:bookmarkStart w:id="12" w:name="_Toc233561750"/>
       <w:r>
         <w:t>What is included</w:t>
       </w:r>
@@ -4239,7 +4517,7 @@
       <w:pPr>
         <w:pStyle w:val="Heading2"/>
       </w:pPr>
-      <w:bookmarkStart w:id="13" w:name="_Toc233560988"/>
+      <w:bookmarkStart w:id="13" w:name="_Toc233561751"/>
       <w:r>
         <w:t>How to run (Node.js 18+)</w:t>
       </w:r>
@@ -4405,10 +4683,10 @@
 <file path=word/numbering.xml><?xml version="1.0" encoding="utf-8"?>
 <w:numbering xmlns:wpc="http://schemas.microsoft.com/office/word/2010/wordprocessingCanvas" xmlns:cx="http://schemas.microsoft.com/office/drawing/2014/chartex" xmlns:cx1="http://schemas.microsoft.com/office/drawing/2015/9/8/chartex" xmlns:cx2="http://schemas.microsoft.com/office/drawing/2015/10/21/chartex" xmlns:cx3="http://schemas.microsoft.com/office/drawing/2016/5/9/chartex" xmlns:cx4="http://schemas.microsoft.com/office/drawing/2016/5/10/chartex" xmlns:cx5="http://schemas.microsoft.com/office/drawing/2016/5/11/chartex" xmlns:cx6="http://schemas.microsoft.com/office/drawing/2016/5/12/chartex" xmlns:cx7="http://schemas.microsoft.com/office/drawing/2016/5/13/chartex" xmlns:cx8="http://schemas.microsoft.com/office/drawing/2016/5/14/chartex" xmlns:mc="http://schemas.openxmlformats.org/markup-compatibility/2006" xmlns:aink="http://schemas.microsoft.com/office/drawing/2016/ink" xmlns:am3d="http://schemas.microsoft.com/office/drawing/2017/model3d" xmlns:o="urn:schemas-microsoft-com:office:office" xmlns:oel="http://schemas.microsoft.com/office/2019/extlst" xmlns:r="http://schemas.openxmlformats.org/officeDocument/2006/relationships" xmlns:m="http://schemas.openxmlformats.org/officeDocument/2006/math" xmlns:v="urn:schemas-microsoft-com:vml" xmlns:wp14="http://schemas.microsoft.com/office/word/2010/wordprocessingDrawing" xmlns:wp="http://schemas.openxmlformats.org/drawingml/2006/wordprocessingDrawing" xmlns:w10="urn:schemas-microsoft-com:office:word" xmlns:w="http://schemas.openxmlformats.org/wordprocessingml/2006/main" xmlns:w14="http://schemas.microsoft.com/office/word/2010/wordml" xmlns:w15="http://schemas.microsoft.com/office/word/2012/wordml" xmlns:w16cex="http://schemas.microsoft.com/office/word/2018/wordml/cex" xmlns:w16cid="http://schemas.microsoft.com/office/word/2016/wordml/cid" xmlns:w16="http://schemas.microsoft.com/office/word/2018/wordml" xmlns:w16du="http://schemas.microsoft.com/office/word/2023/wordml/word16du" xmlns:w16sdtdh="http://schemas.microsoft.com/office/word/2020/wordml/sdtdatahash" xmlns:w16sdtfl="http://schemas.microsoft.com/office/word/2024/wordml/sdtformatlock" xmlns:w16se="http://schemas.microsoft.com/office/word/2015/wordml/symex" xmlns:wpg="http://schemas.microsoft.com/office/word/2010/wordprocessingGroup" xmlns:wpi="http://schemas.microsoft.com/office/word/2010/wordprocessingInk" xmlns:wne="http://schemas.microsoft.com/office/word/2006/wordml" xmlns:wps="http://schemas.microsoft.com/office/word/2010/wordprocessingShape" mc:Ignorable="w14 w15 w16se w16cid w16 w16cex w16sdtdh w16sdtfl w16du wp14">
   <w:abstractNum w:abstractNumId="0" w15:restartNumberingAfterBreak="0">
-    <w:nsid w:val="529154EE"/>
+    <w:nsid w:val="362A25A9"/>
     <w:multiLevelType w:val="hybridMultilevel"/>
-    <w:tmpl w:val="0E4E3888"/>
-    <w:lvl w:ilvl="0" w:tplc="23AAA6CE">
+    <w:tmpl w:val="F4C01AD8"/>
+    <w:lvl w:ilvl="0" w:tplc="16A29A36">
       <w:start w:val="1"/>
       <w:numFmt w:val="bullet"/>
       <w:lvlText w:val="•"/>
@@ -4417,52 +4695,52 @@
         <w:ind w:left="540" w:hanging="260"/>
       </w:pPr>
     </w:lvl>
-    <w:lvl w:ilvl="1" w:tplc="A0A8F292">
+    <w:lvl w:ilvl="1" w:tplc="A0A0B7D6">
       <w:numFmt w:val="decimal"/>
       <w:lvlText w:val=""/>
       <w:lvlJc w:val="left"/>
     </w:lvl>
-    <w:lvl w:ilvl="2" w:tplc="90709EBA">
+    <w:lvl w:ilvl="2" w:tplc="FF26FC8A">
       <w:numFmt w:val="decimal"/>
       <w:lvlText w:val=""/>
       <w:lvlJc w:val="left"/>
     </w:lvl>
-    <w:lvl w:ilvl="3" w:tplc="ED78CAB6">
+    <w:lvl w:ilvl="3" w:tplc="EAE0332A">
       <w:numFmt w:val="decimal"/>
       <w:lvlText w:val=""/>
       <w:lvlJc w:val="left"/>
     </w:lvl>
-    <w:lvl w:ilvl="4" w:tplc="52142D36">
+    <w:lvl w:ilvl="4" w:tplc="33689666">
       <w:numFmt w:val="decimal"/>
       <w:lvlText w:val=""/>
       <w:lvlJc w:val="left"/>
     </w:lvl>
-    <w:lvl w:ilvl="5" w:tplc="BF5805EE">
+    <w:lvl w:ilvl="5" w:tplc="3F1ECDE2">
       <w:numFmt w:val="decimal"/>
       <w:lvlText w:val=""/>
       <w:lvlJc w:val="left"/>
     </w:lvl>
-    <w:lvl w:ilvl="6" w:tplc="F71A304E">
+    <w:lvl w:ilvl="6" w:tplc="05D285E4">
       <w:numFmt w:val="decimal"/>
       <w:lvlText w:val=""/>
       <w:lvlJc w:val="left"/>
     </w:lvl>
-    <w:lvl w:ilvl="7" w:tplc="6A56CEC0">
+    <w:lvl w:ilvl="7" w:tplc="1792929C">
       <w:numFmt w:val="decimal"/>
       <w:lvlText w:val=""/>
       <w:lvlJc w:val="left"/>
     </w:lvl>
-    <w:lvl w:ilvl="8" w:tplc="392245D4">
+    <w:lvl w:ilvl="8" w:tplc="EF448F00">
       <w:numFmt w:val="decimal"/>
       <w:lvlText w:val=""/>
       <w:lvlJc w:val="left"/>
     </w:lvl>
   </w:abstractNum>
   <w:abstractNum w:abstractNumId="1" w15:restartNumberingAfterBreak="0">
-    <w:nsid w:val="796D0C26"/>
+    <w:nsid w:val="6DC209D9"/>
     <w:multiLevelType w:val="hybridMultilevel"/>
-    <w:tmpl w:val="F260E672"/>
-    <w:lvl w:ilvl="0" w:tplc="605E4F52">
+    <w:tmpl w:val="F4703780"/>
+    <w:lvl w:ilvl="0" w:tplc="AD40002C">
       <w:start w:val="1"/>
       <w:numFmt w:val="bullet"/>
       <w:lvlText w:val="●"/>
@@ -4471,7 +4749,7 @@
         <w:ind w:left="720" w:hanging="360"/>
       </w:pPr>
     </w:lvl>
-    <w:lvl w:ilvl="1" w:tplc="8C92348A">
+    <w:lvl w:ilvl="1" w:tplc="EEACD172">
       <w:start w:val="1"/>
       <w:numFmt w:val="bullet"/>
       <w:lvlText w:val="○"/>
@@ -4480,7 +4758,7 @@
         <w:ind w:left="1440" w:hanging="360"/>
       </w:pPr>
     </w:lvl>
-    <w:lvl w:ilvl="2" w:tplc="E0804BA0">
+    <w:lvl w:ilvl="2" w:tplc="B3728B60">
       <w:start w:val="1"/>
       <w:numFmt w:val="bullet"/>
       <w:lvlText w:val="■"/>
@@ -4489,7 +4767,7 @@
         <w:ind w:left="2160" w:hanging="360"/>
       </w:pPr>
     </w:lvl>
-    <w:lvl w:ilvl="3" w:tplc="CFCE8658">
+    <w:lvl w:ilvl="3" w:tplc="55261AD2">
       <w:start w:val="1"/>
       <w:numFmt w:val="bullet"/>
       <w:lvlText w:val="●"/>
@@ -4498,7 +4776,7 @@
         <w:ind w:left="2880" w:hanging="360"/>
       </w:pPr>
     </w:lvl>
-    <w:lvl w:ilvl="4" w:tplc="4A24CB7E">
+    <w:lvl w:ilvl="4" w:tplc="6B52BE1E">
       <w:start w:val="1"/>
       <w:numFmt w:val="bullet"/>
       <w:lvlText w:val="○"/>
@@ -4507,7 +4785,7 @@
         <w:ind w:left="3600" w:hanging="360"/>
       </w:pPr>
     </w:lvl>
-    <w:lvl w:ilvl="5" w:tplc="35D0DA48">
+    <w:lvl w:ilvl="5" w:tplc="03D8F3DA">
       <w:start w:val="1"/>
       <w:numFmt w:val="bullet"/>
       <w:lvlText w:val="■"/>
@@ -4516,7 +4794,7 @@
         <w:ind w:left="4320" w:hanging="360"/>
       </w:pPr>
     </w:lvl>
-    <w:lvl w:ilvl="6" w:tplc="BD9CB242">
+    <w:lvl w:ilvl="6" w:tplc="79589510">
       <w:start w:val="1"/>
       <w:numFmt w:val="bullet"/>
       <w:lvlText w:val="●"/>
@@ -4525,7 +4803,7 @@
         <w:ind w:left="5040" w:hanging="360"/>
       </w:pPr>
     </w:lvl>
-    <w:lvl w:ilvl="7" w:tplc="0DACC69C">
+    <w:lvl w:ilvl="7" w:tplc="03B45662">
       <w:start w:val="1"/>
       <w:numFmt w:val="bullet"/>
       <w:lvlText w:val="●"/>
@@ -4534,7 +4812,7 @@
         <w:ind w:left="5760" w:hanging="360"/>
       </w:pPr>
     </w:lvl>
-    <w:lvl w:ilvl="8" w:tplc="CFDE3272">
+    <w:lvl w:ilvl="8" w:tplc="67BCECB0">
       <w:start w:val="1"/>
       <w:numFmt w:val="bullet"/>
       <w:lvlText w:val="●"/>
@@ -4544,13 +4822,13 @@
       </w:pPr>
     </w:lvl>
   </w:abstractNum>
-  <w:num w:numId="1" w16cid:durableId="1305503865">
+  <w:num w:numId="1" w16cid:durableId="1178887387">
     <w:abstractNumId w:val="1"/>
     <w:lvlOverride w:ilvl="0">
       <w:startOverride w:val="1"/>
     </w:lvlOverride>
   </w:num>
-  <w:num w:numId="2" w16cid:durableId="1756442059">
+  <w:num w:numId="2" w16cid:durableId="91098944">
     <w:abstractNumId w:val="0"/>
     <w:lvlOverride w:ilvl="0">
       <w:startOverride w:val="1"/>
@@ -5169,7 +5447,7 @@
     <w:autoRedefine/>
     <w:uiPriority w:val="39"/>
     <w:unhideWhenUsed/>
-    <w:rsid w:val="000A511C"/>
+    <w:rsid w:val="00E20005"/>
     <w:pPr>
       <w:spacing w:after="100"/>
     </w:pPr>
@@ -5181,7 +5459,7 @@
     <w:autoRedefine/>
     <w:uiPriority w:val="39"/>
     <w:unhideWhenUsed/>
-    <w:rsid w:val="000A511C"/>
+    <w:rsid w:val="00E20005"/>
     <w:pPr>
       <w:spacing w:after="100"/>
       <w:ind w:left="220"/>

</xml_diff>